<commit_message>
Novos arquivos Docx e pdf
</commit_message>
<xml_diff>
--- a/CV_Jefferson_Klamas_Marzani.docx
+++ b/CV_Jefferson_Klamas_Marzani.docx
@@ -59,7 +59,7 @@
         <w:rPr>
           <w:rtl w:val="0"/>
         </w:rPr>
-        <w:t xml:space="preserve">Pinhais - Paraná - Brasil | </w:t>
+        <w:t xml:space="preserve">Paraná - Brasil | </w:t>
       </w:r>
       <w:hyperlink r:id="rId7">
         <w:r>
@@ -1988,7 +1988,7 @@
           <w:bCs w:val="1"/>
           <w:rtl w:val="0"/>
         </w:rPr>
-        <w:t xml:space="preserve">Tecnólogo em Processos Gerenciais</w:t>
+        <w:t xml:space="preserve">Superior de Tecnologia em Processos Gerenciais</w:t>
       </w:r>
       <w:r>
         <w:rPr>

</xml_diff>